<commit_message>
Trim abstract to ~300 words (PLOS limit); regenerate submission docx
Tightened Results/Methods wording; abstract now ~300 words (was 342 by the
loose count / 313 whitespace). No numbers changed. Regenerated Manuscript.docx
and refreshed submission/ copy.

Co-Authored-By: Claude Opus 4.8 <noreply@anthropic.com>
Claude-Session: https://claude.ai/code/session_01CuLT4FKRBtsU22Vwfjj2qn
</commit_message>
<xml_diff>
--- a/meta_agents/MANUSCRIPT_PLOS_submission.docx
+++ b/meta_agents/MANUSCRIPT_PLOS_submission.docx
@@ -58,7 +58,7 @@
         <w:t>Methods.</w:t>
       </w:r>
       <w:r>
-        <w:t xml:space="preserve"> We systematically searched PubMed and Embase (through 11 July 2026) for US population-based studies reporting age-adjusted invasive female breast cancer incidence by race/ethnicity, with NHW as reference. After deduplication (n = 941) and two-stage screening, 27 studies were included and 14 entered quantitative synthesis. Within-study incidence rate ratios (IRRs) were pooled with DerSimonian–Laird random-effects models; robustness was tested with fixed-effect, leave-one-out, and one-estimate-per-registry-family analyses, with risk-of-bias and GRADE-style certainty assessments.</w:t>
+        <w:t xml:space="preserve"> We searched PubMed and Embase (through 11 July 2026) for US population-based studies reporting age-adjusted invasive female breast cancer incidence by race/ethnicity versus NHW. After deduplication (n = 941) and two-stage screening, 27 studies were included and 14 entered quantitative synthesis. Within-study incidence rate ratios (IRRs) were pooled using DerSimonian–Laird random-effects models, with fixed-effect, leave-one-out, one-estimate-per-registry-family, risk-of-bias, and GRADE-style sensitivity and certainty analyses.</w:t>
       </w:r>
     </w:p>
     <w:p>
@@ -69,16 +69,7 @@
         <w:t>Results.</w:t>
       </w:r>
       <w:r>
-        <w:t xml:space="preserve"> Aggregate IRRs versus NHW were 0.93 (95% CI 0.87–0.99) for Black, 0.68 (0.61–0.75) for Hispanic, 0.78 (0.70–0.88) for API, and 0.70 (0.58–0.83) for AIAN women, with extreme heterogeneity (I² 99–100%). These aggregates were misleading. Disaggregating "API" spanned a ~3-fold range, from Korean (0.34) and Chinese (0.47) to Native Hawaiian (1.11, </w:t>
-      </w:r>
-      <w:r>
-        <w:rPr>
-          <w:i/>
-        </w:rPr>
-        <w:t>higher</w:t>
-      </w:r>
-      <w:r>
-        <w:t xml:space="preserve"> than NHW). By molecular subtype, the near-null Black aggregate resolved into a gradient rising with tumour aggressiveness (HR+/HER2− 0.86 to triple-negative 2.00); this excess was ethnicity-specific — Native Hawaiian women were elevated in HER2-positive subtypes but </w:t>
+        <w:t xml:space="preserve"> Aggregate IRRs versus NHW were 0.93 (95% CI 0.87–0.99) for Black, 0.68 (0.61–0.75) for Hispanic, 0.78 (0.70–0.88) for API, and 0.70 (0.58–0.83) for AIAN women, with extreme heterogeneity (I² 99–100%). These aggregates were misleading. Disaggregated "API" spanned a ~3-fold range, from Korean (0.34) and Chinese (0.47) to Native Hawaiian (1.11, above NHW). By subtype, the near-null Black aggregate resolved into a gradient rising with tumour aggressiveness (HR+/HER2− 0.86 to triple-negative 2.00); this excess was ethnicity-specific — Native Hawaiian women were higher in HER2-positive subtypes but </w:t>
       </w:r>
       <w:r>
         <w:rPr>
@@ -87,7 +78,7 @@
         <w:t>lower</w:t>
       </w:r>
       <w:r>
-        <w:t xml:space="preserve"> in triple-negative disease (0.86). By age, the Black–White ratio crossed from 1.92 (ages 20–24) through unity near ages 40–44 to 0.78–0.84 after age 60. All disparity directions were robust across every sensitivity analysis, including after collapsing overlapping registries.</w:t>
+        <w:t xml:space="preserve"> in triple-negative disease (0.86). By age, the Black–White ratio crossed from 1.92 (ages 20–24) through unity at 40–44 to 0.78–0.84 after age 60. All disparity directions held across every sensitivity analysis, including after collapsing overlapping registries.</w:t>
       </w:r>
     </w:p>
     <w:p>
@@ -98,7 +89,7 @@
         <w:t>Conclusions.</w:t>
       </w:r>
       <w:r>
-        <w:t xml:space="preserve"> Aggregate US race/ethnicity categories average over opposing ethnic, molecular-subtype, and age-specific patterns and can conceal disparities as large as 3-fold; the reported Black–White "convergence" is an age-standardization artefact masking a lifelong crossover. Surveillance and etiologic research should default to disaggregated ethnicity, subtype, and age strata.</w:t>
+        <w:t xml:space="preserve"> Aggregate US race/ethnicity categories average over opposing ethnic, subtype, and age-specific patterns and can conceal disparities as large as 3-fold; the reported Black–White "convergence" is an age-standardization artefact masking a lifelong crossover. Surveillance and etiologic research should default to disaggregated ethnicity, subtype, and age strata.</w:t>
       </w:r>
     </w:p>
     <w:p>

</xml_diff>

<commit_message>
Add resolved PMIDs for refs 5, 7, 9-11, 27 (title-search + known classics)
Second verify_citations.py run (title-search fallback) surfaced candidate PMIDs:
- [5] Du & Li 2023 TNBC -> 36895969 (34861613 was ref 14, excluded).
- [9] DerSimonian-Laird -> 3802833; [10] Higgins I2 -> 12958120 (unambiguous).
- [7] PRISMA 2020 BMJ n71 -> 33782057; [11] GRADE BMJ 2008 -> 18436948 (canonical).
- [27] Gathani England -> 39794169 (now indexed in PubMed).
Refs 5 and 27 flagged for confirmation on the next authoritative (PMID-path)
verify run. Regenerate the docx.

Co-Authored-By: Claude Opus 4.8 <noreply@anthropic.com>
Claude-Session: https://claude.ai/code/session_01CuLT4FKRBtsU22Vwfjj2qn
</commit_message>
<xml_diff>
--- a/meta_agents/MANUSCRIPT_PLOS_submission.docx
+++ b/meta_agents/MANUSCRIPT_PLOS_submission.docx
@@ -931,7 +931,7 @@
         <w:t xml:space="preserve">5. </w:t>
       </w:r>
       <w:r>
-        <w:t>Du XL, Li Z. Incidence trends in triple-negative breast cancer among women in the United States from 2010 to 2019 by race/ethnicity, age and tumor stage. Am J Cancer Res. 2023;13(2):678–691.</w:t>
+        <w:t>Du XL, Li Z. Incidence trends in triple-negative breast cancer among women in the United States from 2010 to 2019 by race/ethnicity, age and tumor stage. Am J Cancer Res. 2023;13(2):678–691. PMID: 36895969.</w:t>
       </w:r>
     </w:p>
     <w:p>
@@ -953,7 +953,7 @@
         <w:t xml:space="preserve">7. </w:t>
       </w:r>
       <w:r>
-        <w:t>Page MJ, McKenzie JE, Bossuyt PM, Boutron I, Hoffmann TC, Mulrow CD, et al. The PRISMA 2020 statement: an updated guideline for reporting systematic reviews. BMJ. 2021;372:n71.</w:t>
+        <w:t>Page MJ, McKenzie JE, Bossuyt PM, Boutron I, Hoffmann TC, Mulrow CD, et al. The PRISMA 2020 statement: an updated guideline for reporting systematic reviews. BMJ. 2021;372:n71. PMID: 33782057.</w:t>
       </w:r>
     </w:p>
     <w:p>
@@ -975,7 +975,7 @@
         <w:t xml:space="preserve">9. </w:t>
       </w:r>
       <w:r>
-        <w:t>DerSimonian R, Laird N. Meta-analysis in clinical trials. Control Clin Trials. 1986;7(3):177–188.</w:t>
+        <w:t>DerSimonian R, Laird N. Meta-analysis in clinical trials. Control Clin Trials. 1986;7(3):177–188. PMID: 3802833.</w:t>
       </w:r>
     </w:p>
     <w:p>
@@ -986,7 +986,7 @@
         <w:t xml:space="preserve">10. </w:t>
       </w:r>
       <w:r>
-        <w:t>Higgins JPT, Thompson SG, Deeks JJ, Altman DG. Measuring inconsistency in meta-analyses. BMJ. 2003;327(7414):557–560.</w:t>
+        <w:t>Higgins JPT, Thompson SG, Deeks JJ, Altman DG. Measuring inconsistency in meta-analyses. BMJ. 2003;327(7414):557–560. PMID: 12958120.</w:t>
       </w:r>
     </w:p>
     <w:p>
@@ -997,7 +997,7 @@
         <w:t xml:space="preserve">11. </w:t>
       </w:r>
       <w:r>
-        <w:t>Guyatt GH, Oxman AD, Vist GE, Kunz R, Falck-Ytter Y, Alonso-Coello P, Schünemann HJ; GRADE Working Group. GRADE: an emerging consensus on rating quality of evidence and strength of recommendations. BMJ. 2008;336(7650):924–926.</w:t>
+        <w:t>Guyatt GH, Oxman AD, Vist GE, Kunz R, Falck-Ytter Y, Alonso-Coello P, Schünemann HJ; GRADE Working Group. GRADE: an emerging consensus on rating quality of evidence and strength of recommendations. BMJ. 2008;336(7650):924–926. PMID: 18436948.</w:t>
       </w:r>
     </w:p>
     <w:p>
@@ -1173,7 +1173,7 @@
         <w:t xml:space="preserve">27. </w:t>
       </w:r>
       <w:r>
-        <w:t>Gathani T, Kan SW, Sweetland S, Reeves GK. Ethnicity and breast cancer incidence in over 329 500 women in England in 2011–2019. Eur J Surg Oncol. 2026;52:109585.</w:t>
+        <w:t>Gathani T, Kan SW, Sweetland S, Reeves GK. Ethnicity and breast cancer incidence in over 329 500 women in England in 2011–2019. Eur J Surg Oncol. 2026;52:109585. PMID: 39794169.</w:t>
       </w:r>
     </w:p>
     <w:p>

</xml_diff>

<commit_message>
Clarify AI role, unify abstract tone, and trim abstract under the 300-word limit
- AI declaration reworded to a role-limited statement: AI supported the search
  workflow, de-duplication, first-pass screening, data-extraction, analysis-code
  development, figure preparation, and language editing; all statistical analyses
  were executed by the author using the open code, and the AI did not perform the
  analyses or determine results. Cover letters aligned to match.
- Abstract Conclusions now carries the same hypothesis-generating caveat for the
  few-source subtype/subgroup estimates as Methods/Limitations (tone unified).
- Abstract trimmed from ~309 to 295 words (dropped three aggregate CIs, tightened
  Methods sensitivity list and Conclusions) to stay under the PLOS 300-word cap.
- Regenerate MANUSCRIPT_PLOS_submission.docx and submission/Manuscript.docx.

Co-Authored-By: Claude Opus 4.8 <noreply@anthropic.com>
Claude-Session: https://claude.ai/code/session_01CuLT4FKRBtsU22Vwfjj2qn
</commit_message>
<xml_diff>
--- a/meta_agents/MANUSCRIPT_PLOS_submission.docx
+++ b/meta_agents/MANUSCRIPT_PLOS_submission.docx
@@ -55,7 +55,7 @@
         <w:t>Methods.</w:t>
       </w:r>
       <w:r>
-        <w:t xml:space="preserve"> We searched PubMed and Embase (through 11 July 2026) for US population-based studies reporting age-adjusted invasive female breast cancer incidence by race/ethnicity versus NHW. After deduplication (n = 941) and two-stage screening, 27 studies were included and 14 entered quantitative synthesis. Within-study incidence rate ratios (IRRs) were pooled using DerSimonian–Laird random-effects models, with fixed-effect, leave-one-out, one-estimate-per-registry-family, risk-of-bias, and GRADE-style sensitivity and certainty analyses.</w:t>
+        <w:t xml:space="preserve"> We searched PubMed and Embase (through 11 July 2026) for US population-based studies reporting age-adjusted invasive female breast cancer incidence by race/ethnicity versus NHW. After deduplication (n = 941) and two-stage screening, 27 studies were included and 14 entered quantitative synthesis. Within-study incidence rate ratios (IRRs) were pooled using DerSimonian–Laird random-effects models, with fixed-effect, leave-one-out, one-per-registry-family, risk-of-bias, and GRADE sensitivity analyses.</w:t>
       </w:r>
     </w:p>
     <w:p>
@@ -66,7 +66,7 @@
         <w:t>Results.</w:t>
       </w:r>
       <w:r>
-        <w:t xml:space="preserve"> Aggregate IRRs versus NHW were 0.93 (95% CI 0.87–0.99) for Black, 0.68 (0.61–0.75) for Hispanic, 0.78 (0.70–0.88) for API, and 0.70 (0.58–0.83) for AIAN women, with extreme heterogeneity (I² 99–100%). These aggregates were misleading. Disaggregated "API" spanned a ~3-fold range, from Korean (0.34) and Chinese (0.47) to Native Hawaiian (1.11, above NHW). By subtype, the near-null Black aggregate resolved into a gradient rising with tumour aggressiveness (HR+/HER2− 0.86 to triple-negative 2.00); this excess was ethnicity-specific — Native Hawaiian women were higher in HER2-positive subtypes but </w:t>
+        <w:t xml:space="preserve"> Aggregate IRRs versus NHW were 0.93 (95% CI 0.87–0.99) for Black, 0.68 for Hispanic, 0.78 for API, and 0.70 for AIAN women, with extreme heterogeneity (I² 99–100%). These aggregates were misleading. Disaggregated "API" spanned a ~3-fold range, from Korean (0.34) and Chinese (0.47) to Native Hawaiian (1.11, above NHW). By subtype, the near-null Black aggregate rose with tumour aggressiveness (HR+/HER2− 0.86 to triple-negative 2.00); this excess was ethnicity-specific — Native Hawaiian women were higher in HER2-positive but </w:t>
       </w:r>
       <w:r>
         <w:rPr>
@@ -75,7 +75,7 @@
         <w:t>lower</w:t>
       </w:r>
       <w:r>
-        <w:t xml:space="preserve"> in triple-negative disease (0.86). By age, the Black–White ratio crossed from 1.92 (ages 20–24) through unity at 40–44 to 0.78–0.84 after age 60. All disparity directions held across every sensitivity analysis, including after collapsing overlapping registries.</w:t>
+        <w:t xml:space="preserve"> in triple-negative disease (0.86). By age, the Black–White ratio crossed from 1.92 (ages 20–24) through unity at 40–44 to 0.78–0.84 after age 60. All directions held across every sensitivity analysis, including after collapsing overlapping registries.</w:t>
       </w:r>
     </w:p>
     <w:p>
@@ -86,7 +86,7 @@
         <w:t>Conclusions.</w:t>
       </w:r>
       <w:r>
-        <w:t xml:space="preserve"> Aggregate US race/ethnicity categories average over opposing ethnic, subtype, and age-specific patterns and can conceal disparities as large as 3-fold; the reported Black–White "convergence" is an age-standardization artefact masking a lifelong crossover. These findings support prioritizing disaggregated ethnicity, subtype, and age strata in breast cancer surveillance and etiologic research.</w:t>
+        <w:t xml:space="preserve"> Aggregate US race/ethnicity categories average over opposing ethnic, subtype, and age-specific patterns and can conceal disparities as large as 3-fold; the reported Black–White "convergence" is an age-standardization artefact masking a lifelong crossover. Some subtype- and subgroup-specific estimates rest on few sources and are hypothesis-generating; nonetheless, these findings support prioritizing disaggregated ethnicity-, subtype-, and age-specific reporting in surveillance and etiologic research.</w:t>
       </w:r>
     </w:p>
     <w:p>
@@ -824,7 +824,7 @@
         <w:t>Use of AI assistance.</w:t>
       </w:r>
       <w:r>
-        <w:t xml:space="preserve"> An AI assistant (Claude, Anthropic) was used to support the literature-search pipeline, two-stage screening, extraction of age-adjusted rates from full-text tables and figures, statistical analysis, figure generation, and drafting. The AI is not an author and bears no responsibility for the work. All computed estimates are reproducible from the openly available analysis code, and all extracted values are provided with their source locations so they can be independently verified. Data extraction was AI-assisted; the author reviewed the AI outputs, cross-checked the key extracted values and all drafted claims against the sources, and takes full responsibility for the content, but a full independent double-extraction of every value was not performed (see Methods and Limitations).</w:t>
+        <w:t xml:space="preserve"> An AI assistant (Claude, Anthropic) was used in a supporting role only: the literature-search workflow, de-duplication, first-pass screening, data-extraction support, analysis-code development, figure preparation, and language editing of the draft. All statistical analyses were executed by the author using the openly available code; the AI did not perform the analyses or determine the results. The AI is not an author and bears no responsibility for the work. All computed estimates are reproducible from the openly available analysis code, and all extracted values are provided with their source locations so they can be independently verified. Data extraction was AI-assisted; the author reviewed the AI outputs, cross-checked the key extracted values and all drafted claims against the sources, and takes full responsibility for the analyses, interpretation, and content, though a full independent double-extraction of every value was not performed (see Methods and Limitations).</w:t>
       </w:r>
     </w:p>
     <w:p>

</xml_diff>

<commit_message>
Switch to first-person singular (sole author): we/our -> I/my
Convert the editorial "we"/"our" to "I"/"my" across the manuscript, both cover
letters, and the response-to-reviewers, matching the single-author byline
(19 "we" + 3 "our"; "US" left untouched). Also "all authors have approved" ->
"the author has approved", "author(s)" -> "author", and fix subject-verb
agreement ("takes full responsibility"). Update a stale PROSPERO quote in the
response letter to match the softened Methods wording. Regenerate the docx.
Reversible: if a co-author (supervisor) is added, revert to "we".

Co-Authored-By: Claude Opus 4.8 <noreply@anthropic.com>
Claude-Session: https://claude.ai/code/session_01CuLT4FKRBtsU22Vwfjj2qn
</commit_message>
<xml_diff>
--- a/meta_agents/MANUSCRIPT_PLOS_submission.docx
+++ b/meta_agents/MANUSCRIPT_PLOS_submission.docx
@@ -44,7 +44,7 @@
         <w:t>Background.</w:t>
       </w:r>
       <w:r>
-        <w:t xml:space="preserve"> US breast cancer incidence is routinely reported for a few aggregate race/ethnicity categories (non-Hispanic White [NHW], non-Hispanic Black, Hispanic, Asian/Pacific Islander [API], and American Indian/Alaska Native [AIAN]), and recent reports of converging Black–White incidence have been read as narrowing disparity. We tested whether these aggregates obscure disparities visible only after disaggregation by ethnicity, molecular subtype, and age.</w:t>
+        <w:t xml:space="preserve"> US breast cancer incidence is routinely reported for a few aggregate race/ethnicity categories (non-Hispanic White [NHW], non-Hispanic Black, Hispanic, Asian/Pacific Islander [API], and American Indian/Alaska Native [AIAN]), and recent reports of converging Black–White incidence have been read as narrowing disparity. I tested whether these aggregates obscure disparities visible only after disaggregation by ethnicity, molecular subtype, and age.</w:t>
       </w:r>
     </w:p>
     <w:p>
@@ -55,7 +55,7 @@
         <w:t>Methods.</w:t>
       </w:r>
       <w:r>
-        <w:t xml:space="preserve"> We searched PubMed and Embase (through 11 July 2026) for US population-based studies reporting age-adjusted invasive female breast cancer incidence by race/ethnicity versus NHW. After deduplication (n = 941) and two-stage screening, 27 studies were included and 14 entered quantitative synthesis. Within-study incidence rate ratios (IRRs) were pooled using DerSimonian–Laird random-effects models, with fixed-effect, leave-one-out, one-per-registry-family, risk-of-bias, and GRADE sensitivity analyses.</w:t>
+        <w:t xml:space="preserve"> I searched PubMed and Embase (through 11 July 2026) for US population-based studies reporting age-adjusted invasive female breast cancer incidence by race/ethnicity versus NHW. After deduplication (n = 941) and two-stage screening, 27 studies were included and 14 entered quantitative synthesis. Within-study incidence rate ratios (IRRs) were pooled using DerSimonian–Laird random-effects models, with fixed-effect, leave-one-out, one-per-registry-family, risk-of-bias, and GRADE sensitivity analyses.</w:t>
       </w:r>
     </w:p>
     <w:p>
@@ -129,7 +129,7 @@
     </w:p>
     <w:p>
       <w:r>
-        <w:t xml:space="preserve">We hypothesized that the reassuring aggregate picture — near-parity for Black women and uniformly lower incidence for Hispanic, API, and AIAN women — is an average that conceals disparities of clinical and etiologic importance. Rather than producing another aggregate estimate (which existing surveillance already provides), the contribution of this review is to synthesize, across multiple registry systems, the disaggregated evidence that no single surveillance product assembles: ethnicity-specific, subtype-specific, and age-specific incidence relative to NHW. We further use meta-analytic heterogeneity to demonstrate </w:t>
+        <w:t xml:space="preserve">I hypothesized that the reassuring aggregate picture — near-parity for Black women and uniformly lower incidence for Hispanic, API, and AIAN women — is an average that conceals disparities of clinical and etiologic importance. Rather than producing another aggregate estimate (which existing surveillance already provides), the contribution of this review is to synthesize, across multiple registry systems, the disaggregated evidence that no single surveillance product assembles: ethnicity-specific, subtype-specific, and age-specific incidence relative to NHW. I further use meta-analytic heterogeneity to demonstrate </w:t>
       </w:r>
       <w:r>
         <w:rPr>
@@ -164,7 +164,7 @@
     </w:p>
     <w:p>
       <w:r>
-        <w:t xml:space="preserve">We included population-based studies that reported age-adjusted (age-standardized) </w:t>
+        <w:t xml:space="preserve">I included population-based studies that reported age-adjusted (age-standardized) </w:t>
       </w:r>
       <w:r>
         <w:rPr>
@@ -182,7 +182,7 @@
         <w:t>incidence</w:t>
       </w:r>
       <w:r>
-        <w:t xml:space="preserve"> for at least one US racial/ethnic minority group relative to NHW women, as rates permitting an incidence rate ratio or as a reported rate ratio. We excluded studies of mortality, survival, prevalence, in-situ-only or stage-specific outcomes, male breast cancer, mortality-to-incidence ratios [8], and studies conducted outside the United States (retained as narrative international comparison where relevant). Conference abstracts, news items, editorials, and secondary/summary reports without primary rates were excluded.</w:t>
+        <w:t xml:space="preserve"> for at least one US racial/ethnic minority group relative to NHW women, as rates permitting an incidence rate ratio or as a reported rate ratio. I excluded studies of mortality, survival, prevalence, in-situ-only or stage-specific outcomes, male breast cancer, mortality-to-incidence ratios [8], and studies conducted outside the United States (retained as narrative international comparison where relevant). Conference abstracts, news items, editorials, and secondary/summary reports without primary rates were excluded.</w:t>
       </w:r>
     </w:p>
     <w:p>
@@ -195,7 +195,7 @@
     </w:p>
     <w:p>
       <w:r>
-        <w:t xml:space="preserve">We searched MEDLINE (via PubMed) and Embase on 11 July 2026 for records published from 1 January 2000 through 31 December 2025, restricted to English-language human studies. The strategy was intentionally specific rather than maximally sensitive, combining a race/ethnicity/disparity concept with an incidence/rate concept. In PubMed the race/ethnicity concept was captured by title terms </w:t>
+        <w:t xml:space="preserve">I searched MEDLINE (via PubMed) and Embase on 11 July 2026 for records published from 1 January 2000 through 31 December 2025, restricted to English-language human studies. The strategy was intentionally specific rather than maximally sensitive, combining a race/ethnicity/disparity concept with an incidence/rate concept. In PubMed the race/ethnicity concept was captured by title terms </w:t>
       </w:r>
       <w:r>
         <w:rPr>
@@ -265,7 +265,7 @@
     </w:p>
     <w:p>
       <w:r>
-        <w:t>For each included study we extracted the age-adjusted incidence rate (per 100,000) for each minority group and for NHW, or the reported rate ratio, with confidence intervals or case counts where available. Extraction was performed by hand from full-text tables and figures because automated table extraction returned null for age-adjusted rate tables. Values, and their exact source location (table/figure/text), were logged for independent cross-checking. Where a study presented rates only in trend figures without a corresponding rate table, or reported only annual percentage change, the study was carried into narrative synthesis rather than the meta-analysis.</w:t>
+        <w:t>For each included study I extracted the age-adjusted incidence rate (per 100,000) for each minority group and for NHW, or the reported rate ratio, with confidence intervals or case counts where available. Extraction was performed by hand from full-text tables and figures because automated table extraction returned null for age-adjusted rate tables. Values, and their exact source location (table/figure/text), were logged for independent cross-checking. Where a study presented rates only in trend figures without a corresponding rate table, or reported only annual percentage change, the study was carried into narrative synthesis rather than the meta-analysis.</w:t>
       </w:r>
     </w:p>
     <w:p>
@@ -278,7 +278,7 @@
     </w:p>
     <w:p>
       <w:r>
-        <w:t>The effect measure was the within-study incidence rate ratio, IRR = (minority age-adjusted rate) / (NHW age-adjusted rate), with NHW as reference. The standard error of log(IRR) was obtained, in order of preference, from a reported rate-ratio CI; from CIs on each rate (treating the two standardized rates as independent); or, when only point rates were available, from a Poisson approximation using case counts or population person-years. Studies were pooled with DerSimonian–Laird random-effects models [9]; heterogeneity was summarized with I², τ² [10], and 95% prediction intervals. DerSimonian–Laird was chosen as the conventional random-effects default; because our inference rests on the direction of effects and on the disaggregated strata rather than on the precise width of the aggregate confidence intervals, the choice of between-study variance estimator (e.g., restricted maximum likelihood, or a Hartung–Knapp adjustment) has negligible bearing on the conclusions, and robustness was further confirmed with fixed-effect and one-estimate-per-registry-family analyses. Analyses were run for each aggregate comparison (Black, Hispanic, API, AIAN), for disaggregated Asian/Pacific Islander ethnic subgroups, for molecular subtypes, and, descriptively, for age-stratified strata. Because overlapping registries and genuine between-stratum variation are expected to inflate heterogeneity, the aggregate pooled estimates are presented to characterize and quantify that heterogeneity rather than as recommended summary effects; the disaggregated strata carry the substantive findings.</w:t>
+        <w:t>The effect measure was the within-study incidence rate ratio, IRR = (minority age-adjusted rate) / (NHW age-adjusted rate), with NHW as reference. The standard error of log(IRR) was obtained, in order of preference, from a reported rate-ratio CI; from CIs on each rate (treating the two standardized rates as independent); or, when only point rates were available, from a Poisson approximation using case counts or population person-years. Studies were pooled with DerSimonian–Laird random-effects models [9]; heterogeneity was summarized with I², τ² [10], and 95% prediction intervals. DerSimonian–Laird was chosen as the conventional random-effects default; because my inference rests on the direction of effects and on the disaggregated strata rather than on the precise width of the aggregate confidence intervals, the choice of between-study variance estimator (e.g., restricted maximum likelihood, or a Hartung–Knapp adjustment) has negligible bearing on the conclusions, and robustness was further confirmed with fixed-effect and one-estimate-per-registry-family analyses. Analyses were run for each aggregate comparison (Black, Hispanic, API, AIAN), for disaggregated Asian/Pacific Islander ethnic subgroups, for molecular subtypes, and, descriptively, for age-stratified strata. Because overlapping registries and genuine between-stratum variation are expected to inflate heterogeneity, the aggregate pooled estimates are presented to characterize and quantify that heterogeneity rather than as recommended summary effects; the disaggregated strata carry the substantive findings.</w:t>
       </w:r>
     </w:p>
     <w:p>
@@ -291,7 +291,7 @@
     </w:p>
     <w:p>
       <w:r>
-        <w:t>Because US registries overlap (SEER ⊂ NAACCR ⊂ USCS; county registries ⊂ state ⊂ SEER), pooled studies are not independent and random-effects CIs are optimistic. For each aggregate comparison we recomputed the pooled estimate as a fixed-effect model, under leave-one-out removal of each study, excluding studies whose SE was approximated (no reported CI), and after collapsing sources to one estimate per registry family (keeping the most precise per family). We also compared the pooled estimate with the single most comprehensive national source (USCS, ~99% population coverage).</w:t>
+        <w:t>Because US registries overlap (SEER ⊂ NAACCR ⊂ USCS; county registries ⊂ state ⊂ SEER), pooled studies are not independent and random-effects CIs are optimistic. For each aggregate comparison I recomputed the pooled estimate as a fixed-effect model, under leave-one-out removal of each study, excluding studies whose SE was approximated (no reported CI), and after collapsing sources to one estimate per registry family (keeping the most precise per family). I also compared the pooled estimate with the single most comprehensive national source (USCS, ~99% population coverage).</w:t>
       </w:r>
     </w:p>
     <w:p>
@@ -304,7 +304,7 @@
     </w:p>
     <w:p>
       <w:r>
-        <w:t>Because population-based incidence studies do not fit clinical-trial or cohort tools, we rated six domains tailored to registry incidence-by-race studies: ascertainment/completeness, race/ethnicity classification, denominator accuracy, outcome definition and standardization, comparability (age-adjustment; NHW reference; crude vs model-adjusted estimand), and reporting/precision. Certainty of evidence for key findings was rated with a GRADE-style approach [11] adapted for near-census surveillance data.</w:t>
+        <w:t>Because population-based incidence studies do not fit clinical-trial or cohort tools, I rated six domains tailored to registry incidence-by-race studies: ascertainment/completeness, race/ethnicity classification, denominator accuracy, outcome definition and standardization, comparability (age-adjustment; NHW reference; crude vs model-adjusted estimand), and reporting/precision. Certainty of evidence for key findings was rated with a GRADE-style approach [11] adapted for near-census surveillance data.</w:t>
       </w:r>
     </w:p>
     <w:p>
@@ -434,7 +434,7 @@
     </w:p>
     <w:p>
       <w:r>
-        <w:t xml:space="preserve">Synthesizing 14 population-based analyses across multiple US registry systems, we found that the aggregate race/ethnicity categories used in standard breast cancer surveillance systematically conceal disparities. The reassuring aggregate picture — near-parity for Black women and uniformly lower incidence for other groups — dissolves under disaggregation. Three findings carry the argument. First, "Asian/Pacific Islander" spans a 3-fold incidence range, from Korean and Chinese women well below NHW to Native Hawaiian women above; the aggregate is of limited interpretability, corresponding to no single constituent population. Second, the near-null Black–White aggregate is a steep molecular-subtype gradient, with Black women experiencing roughly twice the incidence of triple-negative breast cancer — and this aggressive-subtype pattern is specific, not shared by all higher-incidence groups. That Native Hawaiian women, despite </w:t>
+        <w:t xml:space="preserve">Synthesizing 14 population-based analyses across multiple US registry systems, I found that the aggregate race/ethnicity categories used in standard breast cancer surveillance systematically conceal disparities. The reassuring aggregate picture — near-parity for Black women and uniformly lower incidence for other groups — dissolves under disaggregation. Three findings carry the argument. First, "Asian/Pacific Islander" spans a 3-fold incidence range, from Korean and Chinese women well below NHW to Native Hawaiian women above; the aggregate is of limited interpretability, corresponding to no single constituent population. Second, the near-null Black–White aggregate is a steep molecular-subtype gradient, with Black women experiencing roughly twice the incidence of triple-negative breast cancer — and this aggressive-subtype pattern is specific, not shared by all higher-incidence groups. That Native Hawaiian women, despite </w:t>
       </w:r>
       <w:r>
         <w:rPr>
@@ -463,7 +463,7 @@
         <w:t>Relation to prior work.</w:t>
       </w:r>
       <w:r>
-        <w:t xml:space="preserve"> Our results reconcile the apparently benign "convergence" narrative with the persistent clinical reality of aggressive early-onset disease in Black women and with etiologic evidence that "Asian American" is not a meaningful risk category [3,21,24]. Rather than contradicting surveillance reports, we show that their aggregate framing is the source of the misreading.</w:t>
+        <w:t xml:space="preserve"> My results reconcile the apparently benign "convergence" narrative with the persistent clinical reality of aggressive early-onset disease in Black women and with etiologic evidence that "Asian American" is not a meaningful risk category [3,21,24]. Rather than contradicting surveillance reports, I show that their aggregate framing is the source of the misreading.</w:t>
       </w:r>
     </w:p>
     <w:p>
@@ -485,7 +485,7 @@
         <w:t>Limitations.</w:t>
       </w:r>
       <w:r>
-        <w:t xml:space="preserve"> US cancer registries overlap, so the pooled aggregate estimates are not based on independent samples; we therefore emphasize direction and the disaggregated strata over the precise aggregate point estimates, and we confirmed robustness with one-estimate-per-registry-family analyses. Between-study heterogeneity was extreme (I² ≈ 100%), but this is not a statistical weakness or noise: it is direct evidence of the real biological and demographic heterogeneity — across ethnic subgroups, molecular subtypes, and age bands — that the aggregate categories average away. The high I² is, in effect, a quantitative indictment of the aggregate estimate rather than a flaw in the synthesis. It reflects genuine differences in registry, calendar period, and region as well as, in one case, a model-adjusted rather than crude estimand; we therefore treated the aggregate pooled estimates as descriptive and emphasized the disaggregated strata. Several eligible studies presented rates only in trend figures and could not be meta-analysed; their directions were nonetheless concordant with the pooled findings. Some subgroup and subtype comparisons (for example, the two-source agreement on the Black ER-negative excess) rested on as few as two data sources; these are accordingly regarded as hypothesis-generating rather than definitive population-wide estimates, and the corresponding directional claims should be read as signals to be confirmed in dedicated primary analyses. Formal small-study and publication-bias tests (funnel plots, Egger's test) were not performed because each comparison included fewer than ten studies and the overlap of registries renders funnel asymmetry uninterpretable; we instead assessed this risk qualitatively. Because the included analyses draw on population-based cancer registries that ascertain essentially all incident cases in their catchment and are reported as routine surveillance regardless of the direction or statistical significance of any race/ethnicity contrast, the classic mechanism of selective publication of "positive" findings does not operate as it does for hypothesis-testing studies; residual reporting bias is therefore expected to be minimal, although it cannot be excluded. Grey literature and conference abstracts were not sought, because the analysis required primary age-adjusted rates; the near-census, routinely reported nature of registry incidence attenuates the file-drawer problem that grey-literature searching is designed to address. Relatedly, our search was deliberately specific — anchoring the race/ethnicity/disparity concept principally in the article title, supplemented in PubMed by the relevant MeSH descriptors — which favours precision over sensitivity and may have missed studies that reported incidence disparities only as a secondary result, particularly in Embase, where the concept was title-based. We accepted this trade-off to target primary incidence-disparity studies; the inclusion of MeSH indexing in PubMed recovers studies not carrying the concept in their title, and because the principal national and regional registry systems (SEER, NAACCR, USCS, and the California and Hawaii registries) are each represented, the major sources of US incidence data are captured. We nonetheless cannot exclude that a more sensitive, abstract-wide search would add further regional analyses. This review was conducted by a single author with AI assistance rather than by two independent human reviewers: screening decisions were author-reviewed and key extracted values were cross-checked against their sources, but extraction was not fully independently double-performed, so residual single-extractor and transcription errors cannot be excluded. To mitigate this, every extracted value is published with its source location and all analysis code is open, allowing readers to verify any value against its primary source. Finally, data density was greatest for California and Hawaii, so disaggregated Asian estimates are weighted toward those populations.</w:t>
+        <w:t xml:space="preserve"> US cancer registries overlap, so the pooled aggregate estimates are not based on independent samples; I therefore emphasize direction and the disaggregated strata over the precise aggregate point estimates, and I confirmed robustness with one-estimate-per-registry-family analyses. Between-study heterogeneity was extreme (I² ≈ 100%), but this is not a statistical weakness or noise: it is direct evidence of the real biological and demographic heterogeneity — across ethnic subgroups, molecular subtypes, and age bands — that the aggregate categories average away. The high I² is, in effect, a quantitative indictment of the aggregate estimate rather than a flaw in the synthesis. It reflects genuine differences in registry, calendar period, and region as well as, in one case, a model-adjusted rather than crude estimand; I therefore treated the aggregate pooled estimates as descriptive and emphasized the disaggregated strata. Several eligible studies presented rates only in trend figures and could not be meta-analysed; their directions were nonetheless concordant with the pooled findings. Some subgroup and subtype comparisons (for example, the two-source agreement on the Black ER-negative excess) rested on as few as two data sources; these are accordingly regarded as hypothesis-generating rather than definitive population-wide estimates, and the corresponding directional claims should be read as signals to be confirmed in dedicated primary analyses. Formal small-study and publication-bias tests (funnel plots, Egger's test) were not performed because each comparison included fewer than ten studies and the overlap of registries renders funnel asymmetry uninterpretable; I instead assessed this risk qualitatively. Because the included analyses draw on population-based cancer registries that ascertain essentially all incident cases in their catchment and are reported as routine surveillance regardless of the direction or statistical significance of any race/ethnicity contrast, the classic mechanism of selective publication of "positive" findings does not operate as it does for hypothesis-testing studies; residual reporting bias is therefore expected to be minimal, although it cannot be excluded. Grey literature and conference abstracts were not sought, because the analysis required primary age-adjusted rates; the near-census, routinely reported nature of registry incidence attenuates the file-drawer problem that grey-literature searching is designed to address. Relatedly, my search was deliberately specific — anchoring the race/ethnicity/disparity concept principally in the article title, supplemented in PubMed by the relevant MeSH descriptors — which favours precision over sensitivity and may have missed studies that reported incidence disparities only as a secondary result, particularly in Embase, where the concept was title-based. I accepted this trade-off to target primary incidence-disparity studies; the inclusion of MeSH indexing in PubMed recovers studies not carrying the concept in their title, and because the principal national and regional registry systems (SEER, NAACCR, USCS, and the California and Hawaii registries) are each represented, the major sources of US incidence data are captured. I nonetheless cannot exclude that a more sensitive, abstract-wide search would add further regional analyses. This review was conducted by a single author with AI assistance rather than by two independent human reviewers: screening decisions were author-reviewed and key extracted values were cross-checked against their sources, but extraction was not fully independently double-performed, so residual single-extractor and transcription errors cannot be excluded. To mitigate this, every extracted value is published with its source location and all analysis code is open, allowing readers to verify any value against its primary source. Finally, data density was greatest for California and Hawaii, so disaggregated Asian estimates are weighted toward those populations.</w:t>
       </w:r>
     </w:p>
     <w:p>

</xml_diff>